<commit_message>
Handbooks: record that dev is merged into master (Phases 1-4)
Co-Authored-By: Claude Sonnet 5.5 <noreply@anthropic.com>
</commit_message>
<xml_diff>
--- a/docs/handbooks/RMS Developer Handbook.docx
+++ b/docs/handbooks/RMS Developer Handbook.docx
@@ -26,7 +26,7 @@
       </w:pPr>
       <w:r>
         <w:rPr/>
-        <w:t xml:space="preserve">Branch dev as of 3 October 2026 (roles plan, Phase 4). Java 21, Spring 7, Tomcat 11, MySQL.</w:t>
+        <w:t xml:space="preserve">Branches master and dev (same commit) as of 3 October 2026 (roles plan, Phases 1-4). Java 21, Spring 7, Tomcat 11, MySQL.</w:t>
       </w:r>
     </w:p>
     <w:p>
@@ -3692,7 +3692,7 @@
             </w:pPr>
             <w:r>
               <w:rPr/>
-              <w:t xml:space="preserve">docs/business-flows/*.md (login, users, masters, candidates, documents, jobs, evaluation)</w:t>
+              <w:t xml:space="preserve">docs/business-flows/*.md (login, users, masters, candidates, documents, jobs, evaluation, schedule)</w:t>
             </w:r>
           </w:p>
         </w:tc>

</xml_diff>